<commit_message>
feat: acelerar analisis y actualizar contratos
</commit_message>
<xml_diff>
--- a/templates/prestacion-casado.docx
+++ b/templates/prestacion-casado.docx
@@ -3205,6 +3205,17 @@
                               </w:rPr>
                               <w:t>EL INTERMEDIARIO</w:t>
                             </w:r>
+                            <w:r>
+                              <w:rPr>
+                                <w:rFonts w:ascii="Roboto Condensed" w:hAnsi="Roboto Condensed" w:cstheme="minorHAnsi"/>
+                                <w:b/>
+                                <w:bCs/>
+                                <w:sz w:val="20"/>
+                                <w:szCs w:val="20"/>
+                              </w:rPr>
+                              <w:br w:type="textWrapping"/>
+                              <w:t>{INTERMEDIARIO_FIRMA}</w:t>
+                            </w:r>
                           </w:p>
                         </w:txbxContent>
                       </wps:txbx>
@@ -3258,6 +3269,17 @@
                           <w:lang w:val="es-EC"/>
                         </w:rPr>
                         <w:t>EL INTERMEDIARIO</w:t>
+                      </w:r>
+                      <w:r>
+                        <w:rPr>
+                          <w:rFonts w:ascii="Roboto Condensed" w:hAnsi="Roboto Condensed" w:cstheme="minorHAnsi"/>
+                          <w:b/>
+                          <w:bCs/>
+                          <w:sz w:val="20"/>
+                          <w:szCs w:val="20"/>
+                        </w:rPr>
+                        <w:br w:type="textWrapping"/>
+                        <w:t>{INTERMEDIARIO_FIRMA}</w:t>
                       </w:r>
                     </w:p>
                   </w:txbxContent>

</xml_diff>

<commit_message>
fix: corrige contratos y precarga de liquidacion
</commit_message>
<xml_diff>
--- a/templates/prestacion-casado.docx
+++ b/templates/prestacion-casado.docx
@@ -3373,6 +3373,20 @@
                               </w:rPr>
                               <w:t>EL CLIENTE</w:t>
                             </w:r>
+                            <w:r>
+                              <w:br/>
+                            </w:r>
+                            <w:r>
+                              <w:rPr>
+                                <w:rFonts w:ascii="Roboto Condensed" w:hAnsi="Roboto Condensed"/>
+                                <w:b/>
+                                <w:bCs/>
+                                <w:sz w:val="20"/>
+                                <w:szCs w:val="20"/>
+                                <w:lang w:val="es-EC"/>
+                              </w:rPr>
+                              <w:t>{NOMBRE_PROP}</w:t>
+                            </w:r>
                           </w:p>
                         </w:txbxContent>
                       </wps:txbx>
@@ -3421,6 +3435,20 @@
                           <w:lang w:val="es-EC"/>
                         </w:rPr>
                         <w:t>EL CLIENTE</w:t>
+                      </w:r>
+                      <w:r>
+                        <w:br/>
+                      </w:r>
+                      <w:r>
+                        <w:rPr>
+                          <w:rFonts w:ascii="Roboto Condensed" w:hAnsi="Roboto Condensed"/>
+                          <w:b/>
+                          <w:bCs/>
+                          <w:sz w:val="20"/>
+                          <w:szCs w:val="20"/>
+                          <w:lang w:val="es-EC"/>
+                        </w:rPr>
+                        <w:t>{NOMBRE_PROP}</w:t>
                       </w:r>
                     </w:p>
                   </w:txbxContent>
@@ -3512,6 +3540,20 @@
                               </w:rPr>
                               <w:t>EL CLIENTE</w:t>
                             </w:r>
+                            <w:r>
+                              <w:br/>
+                            </w:r>
+                            <w:r>
+                              <w:rPr>
+                                <w:rFonts w:ascii="Roboto Condensed" w:hAnsi="Roboto Condensed"/>
+                                <w:b/>
+                                <w:bCs/>
+                                <w:sz w:val="20"/>
+                                <w:szCs w:val="20"/>
+                                <w:lang w:val="es-EC"/>
+                              </w:rPr>
+                              <w:t>{NOMBRE_CONY}</w:t>
+                            </w:r>
                           </w:p>
                         </w:txbxContent>
                       </wps:txbx>
@@ -3560,6 +3602,20 @@
                           <w:lang w:val="es-EC"/>
                         </w:rPr>
                         <w:t>EL CLIENTE</w:t>
+                      </w:r>
+                      <w:r>
+                        <w:br/>
+                      </w:r>
+                      <w:r>
+                        <w:rPr>
+                          <w:rFonts w:ascii="Roboto Condensed" w:hAnsi="Roboto Condensed"/>
+                          <w:b/>
+                          <w:bCs/>
+                          <w:sz w:val="20"/>
+                          <w:szCs w:val="20"/>
+                          <w:lang w:val="es-EC"/>
+                        </w:rPr>
+                        <w:t>{NOMBRE_CONY}</w:t>
                       </w:r>
                     </w:p>
                   </w:txbxContent>

</xml_diff>